<commit_message>
Create Tableau dashboard for traffic analytics
</commit_message>
<xml_diff>
--- a/Reports/Project Report.docx
+++ b/Reports/Project Report.docx
@@ -500,13 +500,7 @@
         <w:rPr>
           <w:rStyle w:val="Strong"/>
         </w:rPr>
-        <w:t>Business Intelligence Dashboard for Smart City Traffic Pattern Analysis</w:t>
-      </w:r>
-      <w:r>
-        <w:rPr>
-          <w:rStyle w:val="Strong"/>
-        </w:rPr>
-        <w:t xml:space="preserve"> </w:t>
+        <w:t xml:space="preserve">Business Intelligence Dashboard for Smart City Traffic Pattern Analysis </w:t>
       </w:r>
       <w:r>
         <w:rPr>
@@ -1679,6 +1673,86 @@
     </w:p>
     <w:p>
       <w:r>
+        <w:rPr>
+          <w:noProof/>
+        </w:rPr>
+        <w:drawing>
+          <wp:inline distT="0" distB="0" distL="0" distR="0" wp14:anchorId="60AFFC76" wp14:editId="52BF97FD">
+            <wp:extent cx="5783580" cy="2014220"/>
+            <wp:effectExtent l="0" t="0" r="7620" b="5080"/>
+            <wp:docPr id="1900159803" name="Picture 4"/>
+            <wp:cNvGraphicFramePr>
+              <a:graphicFrameLocks xmlns:a="http://schemas.openxmlformats.org/drawingml/2006/main" noChangeAspect="1"/>
+            </wp:cNvGraphicFramePr>
+            <a:graphic xmlns:a="http://schemas.openxmlformats.org/drawingml/2006/main">
+              <a:graphicData uri="http://schemas.openxmlformats.org/drawingml/2006/picture">
+                <pic:pic xmlns:pic="http://schemas.openxmlformats.org/drawingml/2006/picture">
+                  <pic:nvPicPr>
+                    <pic:cNvPr id="1900159803" name="Picture 1900159803"/>
+                    <pic:cNvPicPr/>
+                  </pic:nvPicPr>
+                  <pic:blipFill>
+                    <a:blip r:embed="rId11"/>
+                    <a:stretch>
+                      <a:fillRect/>
+                    </a:stretch>
+                  </pic:blipFill>
+                  <pic:spPr>
+                    <a:xfrm>
+                      <a:off x="0" y="0"/>
+                      <a:ext cx="5783580" cy="2014220"/>
+                    </a:xfrm>
+                    <a:prstGeom prst="rect">
+                      <a:avLst/>
+                    </a:prstGeom>
+                  </pic:spPr>
+                </pic:pic>
+              </a:graphicData>
+            </a:graphic>
+          </wp:inline>
+        </w:drawing>
+      </w:r>
+      <w:r>
+        <w:rPr>
+          <w:noProof/>
+        </w:rPr>
+        <w:drawing>
+          <wp:inline distT="0" distB="0" distL="0" distR="0" wp14:anchorId="6EEDC29E" wp14:editId="4B100B4D">
+            <wp:extent cx="5806440" cy="1881505"/>
+            <wp:effectExtent l="0" t="0" r="3810" b="4445"/>
+            <wp:docPr id="1746372127" name="Picture 3"/>
+            <wp:cNvGraphicFramePr>
+              <a:graphicFrameLocks xmlns:a="http://schemas.openxmlformats.org/drawingml/2006/main" noChangeAspect="1"/>
+            </wp:cNvGraphicFramePr>
+            <a:graphic xmlns:a="http://schemas.openxmlformats.org/drawingml/2006/main">
+              <a:graphicData uri="http://schemas.openxmlformats.org/drawingml/2006/picture">
+                <pic:pic xmlns:pic="http://schemas.openxmlformats.org/drawingml/2006/picture">
+                  <pic:nvPicPr>
+                    <pic:cNvPr id="1746372127" name="Picture 1746372127"/>
+                    <pic:cNvPicPr/>
+                  </pic:nvPicPr>
+                  <pic:blipFill>
+                    <a:blip r:embed="rId12"/>
+                    <a:stretch>
+                      <a:fillRect/>
+                    </a:stretch>
+                  </pic:blipFill>
+                  <pic:spPr>
+                    <a:xfrm>
+                      <a:off x="0" y="0"/>
+                      <a:ext cx="5839411" cy="1892189"/>
+                    </a:xfrm>
+                    <a:prstGeom prst="rect">
+                      <a:avLst/>
+                    </a:prstGeom>
+                  </pic:spPr>
+                </pic:pic>
+              </a:graphicData>
+            </a:graphic>
+          </wp:inline>
+        </w:drawing>
+      </w:r>
+      <w:r>
         <w:br w:type="page"/>
       </w:r>
     </w:p>
@@ -2468,8 +2542,8 @@
     </w:p>
     <w:p/>
     <w:sectPr>
-      <w:headerReference w:type="default" r:id="rId11"/>
-      <w:footerReference w:type="default" r:id="rId12"/>
+      <w:headerReference w:type="default" r:id="rId13"/>
+      <w:footerReference w:type="default" r:id="rId14"/>
       <w:pgSz w:w="12240" w:h="15840"/>
       <w:pgMar w:top="1440" w:right="1800" w:bottom="1440" w:left="1800" w:header="720" w:footer="720" w:gutter="0"/>
       <w:pgNumType w:start="0"/>
@@ -7466,6 +7540,7 @@
   <w:style w:type="character" w:default="1" w:styleId="DefaultParagraphFont">
     <w:name w:val="Default Paragraph Font"/>
     <w:uiPriority w:val="1"/>
+    <w:semiHidden/>
     <w:unhideWhenUsed/>
   </w:style>
   <w:style w:type="table" w:default="1" w:styleId="TableNormal">
@@ -18540,8 +18615,10 @@
     <w:rsid w:val="00237551"/>
     <w:rsid w:val="004017B5"/>
     <w:rsid w:val="0047316C"/>
+    <w:rsid w:val="00A95348"/>
     <w:rsid w:val="00C8136D"/>
     <w:rsid w:val="00E65170"/>
+    <w:rsid w:val="00FD159D"/>
   </w:rsids>
   <m:mathPr>
     <m:mathFont m:val="Cambria Math"/>
@@ -18996,39 +19073,6 @@
     <w:name w:val="113B91B722044B5CA975BFEEA3192A6D"/>
     <w:rsid w:val="0047316C"/>
   </w:style>
-  <w:style w:type="paragraph" w:customStyle="1" w:styleId="81A90D4CF2E84F0F83DBE4FCB934DA43">
-    <w:name w:val="81A90D4CF2E84F0F83DBE4FCB934DA43"/>
-    <w:rsid w:val="001F4C6A"/>
-    <w:pPr>
-      <w:spacing w:line="278" w:lineRule="auto"/>
-    </w:pPr>
-    <w:rPr>
-      <w:sz w:val="24"/>
-      <w:szCs w:val="24"/>
-    </w:rPr>
-  </w:style>
-  <w:style w:type="paragraph" w:customStyle="1" w:styleId="55FB344637B94B2696D4A1C7BD158C6B">
-    <w:name w:val="55FB344637B94B2696D4A1C7BD158C6B"/>
-    <w:rsid w:val="001F4C6A"/>
-    <w:pPr>
-      <w:spacing w:line="278" w:lineRule="auto"/>
-    </w:pPr>
-    <w:rPr>
-      <w:sz w:val="24"/>
-      <w:szCs w:val="24"/>
-    </w:rPr>
-  </w:style>
-  <w:style w:type="paragraph" w:customStyle="1" w:styleId="2C4FA07FE307490F822F39FD3588A079">
-    <w:name w:val="2C4FA07FE307490F822F39FD3588A079"/>
-    <w:rsid w:val="001F4C6A"/>
-    <w:pPr>
-      <w:spacing w:line="278" w:lineRule="auto"/>
-    </w:pPr>
-    <w:rPr>
-      <w:sz w:val="24"/>
-      <w:szCs w:val="24"/>
-    </w:rPr>
-  </w:style>
 </w:styles>
 </file>
 

</xml_diff>